<commit_message>
fix profil extractor example fallback, unify example profils
</commit_message>
<xml_diff>
--- a/examples/templates/de/cover_letter_template.docx
+++ b/examples/templates/de/cover_letter_template.docx
@@ -17,7 +17,7 @@
           <w:b/>
           <w:bCs/>
         </w:rPr>
-        <w:t>Johannes Schmidt</w:t>
+        <w:t>Pepito Perez</w:t>
       </w:r>
     </w:p>
     <w:p>
@@ -29,7 +29,7 @@
       </w:pPr>
       <w:r>
         <w:rPr/>
-        <w:t>Musterstraße 42, 10115 Berlin, Deutschland</w:t>
+        <w:t>742 Maple Avenue, Apt 3B, Cambridge, MA 02139, USA</w:t>
       </w:r>
     </w:p>
     <w:p>
@@ -41,7 +41,7 @@
       </w:pPr>
       <w:r>
         <w:rPr/>
-        <w:t>johannes.schmidt@beispiel.de</w:t>
+        <w:t>pepito.perez@example.com</w:t>
       </w:r>
     </w:p>
     <w:p>
@@ -53,12 +53,12 @@
       </w:pPr>
       <w:r>
         <w:rPr/>
-        <w:t>+49 (30) 9876-5432</w:t>
+        <w:t>+1 (555) 123-4567</w:t>
         <w:br/>
+        <w:t>______________________________________________________________________________</w:t>
       </w:r>
       <w:r>
         <w:rPr/>
-        <w:t>______________________________________________________________________________</w:t>
       </w:r>
     </w:p>
     <w:p>
@@ -179,7 +179,7 @@
       </w:pPr>
       <w:r>
         <w:rPr/>
-        <w:t>Johannes Schmidt</w:t>
+        <w:t>Pepito Perez</w:t>
       </w:r>
     </w:p>
     <w:sectPr>

</xml_diff>